<commit_message>
Add IAM Access screenshots
</commit_message>
<xml_diff>
--- a/outputs/Assignment_week_4.docx
+++ b/outputs/Assignment_week_4.docx
@@ -45,8 +45,11 @@
         <w:t>Create Resource Group</w:t>
       </w:r>
       <w:r>
+        <w:rPr>
+          <w:noProof/>
+        </w:rPr>
         <w:drawing>
-          <wp:inline distT="0" distB="0" distL="0" distR="0" wp14:anchorId="1D9D0B91" wp14:editId="0AA0B420">
+          <wp:inline distT="0" distB="0" distL="0" distR="0" wp14:anchorId="7E0D1408" wp14:editId="56C6602E">
             <wp:extent cx="5730240" cy="2590800"/>
             <wp:effectExtent l="0" t="0" r="3810" b="0"/>
             <wp:docPr id="133874032" name="Picture 20"/>
@@ -116,8 +119,11 @@
         <w:t>Create Storage Account</w:t>
       </w:r>
       <w:r>
+        <w:rPr>
+          <w:noProof/>
+        </w:rPr>
         <w:drawing>
-          <wp:inline distT="0" distB="0" distL="0" distR="0" wp14:anchorId="2CD175B2" wp14:editId="59D49FE3">
+          <wp:inline distT="0" distB="0" distL="0" distR="0" wp14:anchorId="1364A67F" wp14:editId="17540B30">
             <wp:extent cx="5730240" cy="2636520"/>
             <wp:effectExtent l="0" t="0" r="3810" b="0"/>
             <wp:docPr id="202146369" name="Picture 19"/>
@@ -192,10 +198,11 @@
       </w:r>
       <w:r>
         <w:rPr>
+          <w:noProof/>
           <w:lang w:val="en-US"/>
         </w:rPr>
         <w:drawing>
-          <wp:inline distT="0" distB="0" distL="0" distR="0" wp14:anchorId="7A9CF418" wp14:editId="12DEA922">
+          <wp:inline distT="0" distB="0" distL="0" distR="0" wp14:anchorId="0E3DFAFF" wp14:editId="7AD2B1D8">
             <wp:extent cx="5731510" cy="2466340"/>
             <wp:effectExtent l="0" t="0" r="2540" b="0"/>
             <wp:docPr id="1767764344" name="Picture 18"/>
@@ -265,8 +272,11 @@
         <w:t>Create ADF</w:t>
       </w:r>
       <w:r>
+        <w:rPr>
+          <w:noProof/>
+        </w:rPr>
         <w:drawing>
-          <wp:inline distT="0" distB="0" distL="0" distR="0" wp14:anchorId="724D3307" wp14:editId="181C6EA6">
+          <wp:inline distT="0" distB="0" distL="0" distR="0" wp14:anchorId="7FFDA7EC" wp14:editId="411FFDB3">
             <wp:extent cx="5730240" cy="2575560"/>
             <wp:effectExtent l="0" t="0" r="3810" b="0"/>
             <wp:docPr id="1820170295" name="Picture 17"/>
@@ -315,11 +325,14 @@
         </w:drawing>
       </w:r>
       <w:r>
+        <w:rPr>
+          <w:noProof/>
+        </w:rPr>
         <w:drawing>
-          <wp:inline distT="0" distB="0" distL="0" distR="0" wp14:anchorId="16AB8C8E" wp14:editId="5C4CB3FF">
+          <wp:inline distT="0" distB="0" distL="0" distR="0" wp14:anchorId="03548456" wp14:editId="2C9FFBF4">
             <wp:extent cx="5730240" cy="2606040"/>
             <wp:effectExtent l="0" t="0" r="3810" b="3810"/>
-            <wp:docPr id="88456813" name="Picture 16"/>
+            <wp:docPr id="88456813" name="Picture 16" descr="A screenshot of a computer&#10;&#10;AI-generated content may be incorrect."/>
             <wp:cNvGraphicFramePr>
               <a:graphicFrameLocks xmlns:a="http://schemas.openxmlformats.org/drawingml/2006/main" noChangeAspect="1"/>
             </wp:cNvGraphicFramePr>
@@ -327,7 +340,7 @@
               <a:graphicData uri="http://schemas.openxmlformats.org/drawingml/2006/picture">
                 <pic:pic xmlns:pic="http://schemas.openxmlformats.org/drawingml/2006/picture">
                   <pic:nvPicPr>
-                    <pic:cNvPr id="0" name="Picture 9"/>
+                    <pic:cNvPr id="88456813" name="Picture 16" descr="A screenshot of a computer&#10;&#10;AI-generated content may be incorrect."/>
                     <pic:cNvPicPr>
                       <a:picLocks noChangeAspect="1" noChangeArrowheads="1"/>
                     </pic:cNvPicPr>
@@ -365,7 +378,11 @@
         </w:drawing>
       </w:r>
     </w:p>
-    <w:p/>
+    <w:p>
+      <w:pPr>
+        <w:pStyle w:val="ListParagraph"/>
+      </w:pPr>
+    </w:p>
     <w:p>
       <w:pPr>
         <w:numPr>
@@ -374,14 +391,140 @@
         </w:numPr>
       </w:pPr>
       <w:r>
+        <w:t>IAM Access to Storage Account</w:t>
+      </w:r>
+      <w:r>
+        <w:rPr>
+          <w:noProof/>
+        </w:rPr>
+        <w:drawing>
+          <wp:inline distT="0" distB="0" distL="0" distR="0" wp14:anchorId="402853C4" wp14:editId="6622607D">
+            <wp:extent cx="5731510" cy="1490345"/>
+            <wp:effectExtent l="0" t="0" r="2540" b="0"/>
+            <wp:docPr id="1527072266" name="Picture 4"/>
+            <wp:cNvGraphicFramePr>
+              <a:graphicFrameLocks xmlns:a="http://schemas.openxmlformats.org/drawingml/2006/main" noChangeAspect="1"/>
+            </wp:cNvGraphicFramePr>
+            <a:graphic xmlns:a="http://schemas.openxmlformats.org/drawingml/2006/main">
+              <a:graphicData uri="http://schemas.openxmlformats.org/drawingml/2006/picture">
+                <pic:pic xmlns:pic="http://schemas.openxmlformats.org/drawingml/2006/picture">
+                  <pic:nvPicPr>
+                    <pic:cNvPr id="0" name="Picture 13"/>
+                    <pic:cNvPicPr>
+                      <a:picLocks noChangeAspect="1" noChangeArrowheads="1"/>
+                    </pic:cNvPicPr>
+                  </pic:nvPicPr>
+                  <pic:blipFill>
+                    <a:blip r:embed="rId10" cstate="print">
+                      <a:extLst>
+                        <a:ext uri="{28A0092B-C50C-407E-A947-70E740481C1C}">
+                          <a14:useLocalDpi xmlns:a14="http://schemas.microsoft.com/office/drawing/2010/main" val="0"/>
+                        </a:ext>
+                      </a:extLst>
+                    </a:blip>
+                    <a:srcRect/>
+                    <a:stretch>
+                      <a:fillRect/>
+                    </a:stretch>
+                  </pic:blipFill>
+                  <pic:spPr bwMode="auto">
+                    <a:xfrm>
+                      <a:off x="0" y="0"/>
+                      <a:ext cx="5731510" cy="1490345"/>
+                    </a:xfrm>
+                    <a:prstGeom prst="rect">
+                      <a:avLst/>
+                    </a:prstGeom>
+                    <a:noFill/>
+                    <a:ln>
+                      <a:noFill/>
+                    </a:ln>
+                  </pic:spPr>
+                </pic:pic>
+              </a:graphicData>
+            </a:graphic>
+          </wp:inline>
+        </w:drawing>
+      </w:r>
+    </w:p>
+    <w:p>
+      <w:pPr>
+        <w:ind w:left="720"/>
+      </w:pPr>
+      <w:r>
+        <w:rPr>
+          <w:noProof/>
+        </w:rPr>
+        <w:drawing>
+          <wp:inline distT="0" distB="0" distL="0" distR="0" wp14:anchorId="4FDC96E4" wp14:editId="5C958FDA">
+            <wp:extent cx="5731510" cy="2614930"/>
+            <wp:effectExtent l="0" t="0" r="2540" b="0"/>
+            <wp:docPr id="247156022" name="Picture 2"/>
+            <wp:cNvGraphicFramePr>
+              <a:graphicFrameLocks xmlns:a="http://schemas.openxmlformats.org/drawingml/2006/main" noChangeAspect="1"/>
+            </wp:cNvGraphicFramePr>
+            <a:graphic xmlns:a="http://schemas.openxmlformats.org/drawingml/2006/main">
+              <a:graphicData uri="http://schemas.openxmlformats.org/drawingml/2006/picture">
+                <pic:pic xmlns:pic="http://schemas.openxmlformats.org/drawingml/2006/picture">
+                  <pic:nvPicPr>
+                    <pic:cNvPr id="0" name="Picture 6"/>
+                    <pic:cNvPicPr>
+                      <a:picLocks noChangeAspect="1" noChangeArrowheads="1"/>
+                    </pic:cNvPicPr>
+                  </pic:nvPicPr>
+                  <pic:blipFill>
+                    <a:blip r:embed="rId11" cstate="print">
+                      <a:extLst>
+                        <a:ext uri="{28A0092B-C50C-407E-A947-70E740481C1C}">
+                          <a14:useLocalDpi xmlns:a14="http://schemas.microsoft.com/office/drawing/2010/main" val="0"/>
+                        </a:ext>
+                      </a:extLst>
+                    </a:blip>
+                    <a:srcRect/>
+                    <a:stretch>
+                      <a:fillRect/>
+                    </a:stretch>
+                  </pic:blipFill>
+                  <pic:spPr bwMode="auto">
+                    <a:xfrm>
+                      <a:off x="0" y="0"/>
+                      <a:ext cx="5731510" cy="2614930"/>
+                    </a:xfrm>
+                    <a:prstGeom prst="rect">
+                      <a:avLst/>
+                    </a:prstGeom>
+                    <a:noFill/>
+                    <a:ln>
+                      <a:noFill/>
+                    </a:ln>
+                  </pic:spPr>
+                </pic:pic>
+              </a:graphicData>
+            </a:graphic>
+          </wp:inline>
+        </w:drawing>
+      </w:r>
+    </w:p>
+    <w:p/>
+    <w:p>
+      <w:pPr>
+        <w:numPr>
+          <w:ilvl w:val="0"/>
+          <w:numId w:val="1"/>
+        </w:numPr>
+      </w:pPr>
+      <w:r>
         <w:rPr>
           <w:lang w:val="en-US"/>
         </w:rPr>
         <w:t>Create Linked Services</w:t>
       </w:r>
       <w:r>
+        <w:rPr>
+          <w:noProof/>
+        </w:rPr>
         <w:drawing>
-          <wp:inline distT="0" distB="0" distL="0" distR="0" wp14:anchorId="4E3BE48C" wp14:editId="53738C6A">
+          <wp:inline distT="0" distB="0" distL="0" distR="0" wp14:anchorId="70BC9507" wp14:editId="0DAE30E5">
             <wp:extent cx="5722620" cy="2598420"/>
             <wp:effectExtent l="0" t="0" r="0" b="0"/>
             <wp:docPr id="509548241" name="Picture 15"/>
@@ -398,7 +541,7 @@
                     </pic:cNvPicPr>
                   </pic:nvPicPr>
                   <pic:blipFill>
-                    <a:blip r:embed="rId10" cstate="print">
+                    <a:blip r:embed="rId12" cstate="print">
                       <a:extLst>
                         <a:ext uri="{28A0092B-C50C-407E-A947-70E740481C1C}">
                           <a14:useLocalDpi xmlns:a14="http://schemas.microsoft.com/office/drawing/2010/main" val="0"/>
@@ -448,11 +591,15 @@
         <w:rPr>
           <w:lang w:val="en-US"/>
         </w:rPr>
+        <w:lastRenderedPageBreak/>
         <w:t>Create Source and Destination Datasets and Pipeline</w:t>
       </w:r>
       <w:r>
+        <w:rPr>
+          <w:noProof/>
+        </w:rPr>
         <w:drawing>
-          <wp:inline distT="0" distB="0" distL="0" distR="0" wp14:anchorId="6ABBBB34" wp14:editId="56E4A024">
+          <wp:inline distT="0" distB="0" distL="0" distR="0" wp14:anchorId="6E9684B3" wp14:editId="1F6DBA1F">
             <wp:extent cx="4739640" cy="5044440"/>
             <wp:effectExtent l="0" t="0" r="3810" b="3810"/>
             <wp:docPr id="1087343104" name="Picture 14"/>
@@ -469,7 +616,7 @@
                     </pic:cNvPicPr>
                   </pic:nvPicPr>
                   <pic:blipFill>
-                    <a:blip r:embed="rId11">
+                    <a:blip r:embed="rId13">
                       <a:extLst>
                         <a:ext uri="{28A0092B-C50C-407E-A947-70E740481C1C}">
                           <a14:useLocalDpi xmlns:a14="http://schemas.microsoft.com/office/drawing/2010/main" val="0"/>
@@ -525,7 +672,6 @@
         <w:t>Executed Pipeline Results</w:t>
       </w:r>
     </w:p>
-    <w:p/>
     <w:p>
       <w:r>
         <w:t>Pipeline Execution results</w:t>
@@ -538,8 +684,11 @@
         </w:rPr>
       </w:pPr>
       <w:r>
+        <w:rPr>
+          <w:noProof/>
+        </w:rPr>
         <w:drawing>
-          <wp:inline distT="0" distB="0" distL="0" distR="0" wp14:anchorId="3F09ACC2" wp14:editId="44D2F09A">
+          <wp:inline distT="0" distB="0" distL="0" distR="0" wp14:anchorId="4F89EABD" wp14:editId="78FF2654">
             <wp:extent cx="4792980" cy="1760220"/>
             <wp:effectExtent l="0" t="0" r="0" b="0"/>
             <wp:docPr id="303067311" name="Picture 13"/>
@@ -556,7 +705,7 @@
                     </pic:cNvPicPr>
                   </pic:nvPicPr>
                   <pic:blipFill>
-                    <a:blip r:embed="rId12">
+                    <a:blip r:embed="rId14">
                       <a:extLst>
                         <a:ext uri="{28A0092B-C50C-407E-A947-70E740481C1C}">
                           <a14:useLocalDpi xmlns:a14="http://schemas.microsoft.com/office/drawing/2010/main" val="0"/>
@@ -601,20 +750,31 @@
           <w:lang w:val="en-US"/>
         </w:rPr>
       </w:pPr>
-      <w:r>
-        <w:rPr>
-          <w:lang w:val="en-US"/>
-        </w:rPr>
+    </w:p>
+    <w:p>
+      <w:pPr>
+        <w:rPr>
+          <w:lang w:val="en-US"/>
+        </w:rPr>
+      </w:pPr>
+      <w:r>
+        <w:rPr>
+          <w:lang w:val="en-US"/>
+        </w:rPr>
+        <w:lastRenderedPageBreak/>
         <w:t>Before Pipeline Execution</w:t>
       </w:r>
     </w:p>
     <w:p>
       <w:r>
+        <w:rPr>
+          <w:noProof/>
+        </w:rPr>
         <w:drawing>
-          <wp:inline distT="0" distB="0" distL="0" distR="0" wp14:anchorId="71355368" wp14:editId="77865D11">
+          <wp:inline distT="0" distB="0" distL="0" distR="0" wp14:anchorId="6F6E6444" wp14:editId="10917E6F">
             <wp:extent cx="5730240" cy="2308860"/>
             <wp:effectExtent l="0" t="0" r="3810" b="0"/>
-            <wp:docPr id="1962723396" name="Picture 12"/>
+            <wp:docPr id="1962723396" name="Picture 12" descr="A screenshot of a computer&#10;&#10;AI-generated content may be incorrect."/>
             <wp:cNvGraphicFramePr>
               <a:graphicFrameLocks xmlns:a="http://schemas.openxmlformats.org/drawingml/2006/main" noChangeAspect="1"/>
             </wp:cNvGraphicFramePr>
@@ -622,13 +782,13 @@
               <a:graphicData uri="http://schemas.openxmlformats.org/drawingml/2006/picture">
                 <pic:pic xmlns:pic="http://schemas.openxmlformats.org/drawingml/2006/picture">
                   <pic:nvPicPr>
-                    <pic:cNvPr id="0" name="Picture 17"/>
+                    <pic:cNvPr id="1962723396" name="Picture 12" descr="A screenshot of a computer&#10;&#10;AI-generated content may be incorrect."/>
                     <pic:cNvPicPr>
                       <a:picLocks noChangeAspect="1" noChangeArrowheads="1"/>
                     </pic:cNvPicPr>
                   </pic:nvPicPr>
                   <pic:blipFill>
-                    <a:blip r:embed="rId13">
+                    <a:blip r:embed="rId15">
                       <a:extLst>
                         <a:ext uri="{28A0092B-C50C-407E-A947-70E740481C1C}">
                           <a14:useLocalDpi xmlns:a14="http://schemas.microsoft.com/office/drawing/2010/main" val="0"/>
@@ -672,12 +832,14 @@
         <w:rPr>
           <w:lang w:val="en-US"/>
         </w:rPr>
-        <w:lastRenderedPageBreak/>
         <w:t>After Pipeline Execution</w:t>
       </w:r>
       <w:r>
+        <w:rPr>
+          <w:noProof/>
+        </w:rPr>
         <w:drawing>
-          <wp:inline distT="0" distB="0" distL="0" distR="0" wp14:anchorId="25CDC12E" wp14:editId="59145CF6">
+          <wp:inline distT="0" distB="0" distL="0" distR="0" wp14:anchorId="7B81DDF1" wp14:editId="402C5BD0">
             <wp:extent cx="5731510" cy="2717165"/>
             <wp:effectExtent l="0" t="0" r="2540" b="6985"/>
             <wp:docPr id="240414576" name="Picture 11"/>
@@ -694,7 +856,7 @@
                     </pic:cNvPicPr>
                   </pic:nvPicPr>
                   <pic:blipFill>
-                    <a:blip r:embed="rId14">
+                    <a:blip r:embed="rId16">
                       <a:extLst>
                         <a:ext uri="{28A0092B-C50C-407E-A947-70E740481C1C}">
                           <a14:useLocalDpi xmlns:a14="http://schemas.microsoft.com/office/drawing/2010/main" val="0"/>
@@ -734,18 +896,25 @@
       </w:pPr>
     </w:p>
     <w:p>
-      <w:pPr>
-        <w:rPr>
-          <w:lang w:val="en-US"/>
-        </w:rPr>
-      </w:pPr>
-    </w:p>
-    <w:p>
-      <w:r>
-        <w:rPr>
-          <w:lang w:val="en-US"/>
-        </w:rPr>
-        <w:t xml:space="preserve">Brief Summary:- </w:t>
+      <w:r>
+        <w:rPr>
+          <w:lang w:val="en-US"/>
+        </w:rPr>
+        <w:t xml:space="preserve">Brief </w:t>
+      </w:r>
+      <w:proofErr w:type="gramStart"/>
+      <w:r>
+        <w:rPr>
+          <w:lang w:val="en-US"/>
+        </w:rPr>
+        <w:t>Summary:-</w:t>
+      </w:r>
+      <w:proofErr w:type="gramEnd"/>
+      <w:r>
+        <w:rPr>
+          <w:lang w:val="en-US"/>
+        </w:rPr>
+        <w:t xml:space="preserve"> </w:t>
       </w:r>
       <w:r>
         <w:rPr>
@@ -764,6 +933,7 @@
     </w:p>
     <w:p>
       <w:r>
+        <w:lastRenderedPageBreak/>
         <w:t>A pipeline was built with a Get Metadata activity to validate file existence and a Copy Data activity to transfer the CSV from source to destination. The pipeline was executed successfully, and the copied file appeared in the destination container.</w:t>
       </w:r>
     </w:p>
@@ -774,6 +944,8 @@
         </w:rPr>
       </w:pPr>
     </w:p>
+    <w:p/>
+    <w:p/>
     <w:p/>
     <w:sectPr>
       <w:pgSz w:w="11906" w:h="16838"/>
@@ -1306,6 +1478,7 @@
   <w:style w:type="paragraph" w:default="1" w:styleId="Normal">
     <w:name w:val="Normal"/>
     <w:qFormat/>
+    <w:rsid w:val="00995DFC"/>
   </w:style>
   <w:style w:type="paragraph" w:styleId="Heading1">
     <w:name w:val="heading 1"/>
@@ -1509,6 +1682,7 @@
   <w:style w:type="character" w:default="1" w:styleId="DefaultParagraphFont">
     <w:name w:val="Default Paragraph Font"/>
     <w:uiPriority w:val="1"/>
+    <w:semiHidden/>
     <w:unhideWhenUsed/>
   </w:style>
   <w:style w:type="table" w:default="1" w:styleId="TableNormal">

</xml_diff>

<commit_message>
Add Pipeline Structure Screenshot
</commit_message>
<xml_diff>
--- a/outputs/Assignment_week_4.docx
+++ b/outputs/Assignment_week_4.docx
@@ -202,7 +202,7 @@
           <w:lang w:val="en-US"/>
         </w:rPr>
         <w:drawing>
-          <wp:inline distT="0" distB="0" distL="0" distR="0" wp14:anchorId="0E3DFAFF" wp14:editId="7AD2B1D8">
+          <wp:inline distT="0" distB="0" distL="0" distR="0" wp14:anchorId="0E3DFAFF" wp14:editId="620EF22A">
             <wp:extent cx="5731510" cy="2466340"/>
             <wp:effectExtent l="0" t="0" r="2540" b="0"/>
             <wp:docPr id="1767764344" name="Picture 18"/>
@@ -398,7 +398,7 @@
           <w:noProof/>
         </w:rPr>
         <w:drawing>
-          <wp:inline distT="0" distB="0" distL="0" distR="0" wp14:anchorId="402853C4" wp14:editId="6622607D">
+          <wp:inline distT="0" distB="0" distL="0" distR="0" wp14:anchorId="402853C4" wp14:editId="6D229083">
             <wp:extent cx="5731510" cy="1490345"/>
             <wp:effectExtent l="0" t="0" r="2540" b="0"/>
             <wp:docPr id="1527072266" name="Picture 4"/>
@@ -673,6 +673,75 @@
       </w:r>
     </w:p>
     <w:p>
+      <w:pPr>
+        <w:rPr>
+          <w:lang w:val="en-US"/>
+        </w:rPr>
+      </w:pPr>
+      <w:r>
+        <w:rPr>
+          <w:lang w:val="en-US"/>
+        </w:rPr>
+        <w:t>Pipeline Built</w:t>
+      </w:r>
+      <w:r>
+        <w:rPr>
+          <w:lang w:val="en-US"/>
+        </w:rPr>
+        <w:br/>
+        <w:t xml:space="preserve"> </w:t>
+      </w:r>
+      <w:r>
+        <w:rPr>
+          <w:lang w:val="en-US"/>
+        </w:rPr>
+        <w:drawing>
+          <wp:inline distT="0" distB="0" distL="0" distR="0" wp14:anchorId="76B9CE37" wp14:editId="32E5C7E2">
+            <wp:extent cx="3942893" cy="1411834"/>
+            <wp:effectExtent l="0" t="0" r="0" b="0"/>
+            <wp:docPr id="1521128155" name="Picture 1" descr="A screenshot of a computer&#10;&#10;AI-generated content may be incorrect."/>
+            <wp:cNvGraphicFramePr>
+              <a:graphicFrameLocks xmlns:a="http://schemas.openxmlformats.org/drawingml/2006/main" noChangeAspect="1"/>
+            </wp:cNvGraphicFramePr>
+            <a:graphic xmlns:a="http://schemas.openxmlformats.org/drawingml/2006/main">
+              <a:graphicData uri="http://schemas.openxmlformats.org/drawingml/2006/picture">
+                <pic:pic xmlns:pic="http://schemas.openxmlformats.org/drawingml/2006/picture">
+                  <pic:nvPicPr>
+                    <pic:cNvPr id="1521128155" name="Picture 1" descr="A screenshot of a computer&#10;&#10;AI-generated content may be incorrect."/>
+                    <pic:cNvPicPr/>
+                  </pic:nvPicPr>
+                  <pic:blipFill rotWithShape="1">
+                    <a:blip r:embed="rId14"/>
+                    <a:srcRect l="30503" t="15492" r="695" b="30141"/>
+                    <a:stretch>
+                      <a:fillRect/>
+                    </a:stretch>
+                  </pic:blipFill>
+                  <pic:spPr bwMode="auto">
+                    <a:xfrm>
+                      <a:off x="0" y="0"/>
+                      <a:ext cx="3943349" cy="1411997"/>
+                    </a:xfrm>
+                    <a:prstGeom prst="rect">
+                      <a:avLst/>
+                    </a:prstGeom>
+                    <a:ln>
+                      <a:noFill/>
+                    </a:ln>
+                    <a:extLst>
+                      <a:ext uri="{53640926-AAD7-44D8-BBD7-CCE9431645EC}">
+                        <a14:shadowObscured xmlns:a14="http://schemas.microsoft.com/office/drawing/2010/main"/>
+                      </a:ext>
+                    </a:extLst>
+                  </pic:spPr>
+                </pic:pic>
+              </a:graphicData>
+            </a:graphic>
+          </wp:inline>
+        </w:drawing>
+      </w:r>
+    </w:p>
+    <w:p>
       <w:r>
         <w:t>Pipeline Execution results</w:t>
       </w:r>
@@ -687,6 +756,7 @@
         <w:rPr>
           <w:noProof/>
         </w:rPr>
+        <w:lastRenderedPageBreak/>
         <w:drawing>
           <wp:inline distT="0" distB="0" distL="0" distR="0" wp14:anchorId="4F89EABD" wp14:editId="78FF2654">
             <wp:extent cx="4792980" cy="1760220"/>
@@ -705,7 +775,7 @@
                     </pic:cNvPicPr>
                   </pic:nvPicPr>
                   <pic:blipFill>
-                    <a:blip r:embed="rId14">
+                    <a:blip r:embed="rId15">
                       <a:extLst>
                         <a:ext uri="{28A0092B-C50C-407E-A947-70E740481C1C}">
                           <a14:useLocalDpi xmlns:a14="http://schemas.microsoft.com/office/drawing/2010/main" val="0"/>
@@ -761,7 +831,6 @@
         <w:rPr>
           <w:lang w:val="en-US"/>
         </w:rPr>
-        <w:lastRenderedPageBreak/>
         <w:t>Before Pipeline Execution</w:t>
       </w:r>
     </w:p>
@@ -788,7 +857,7 @@
                     </pic:cNvPicPr>
                   </pic:nvPicPr>
                   <pic:blipFill>
-                    <a:blip r:embed="rId15">
+                    <a:blip r:embed="rId16">
                       <a:extLst>
                         <a:ext uri="{28A0092B-C50C-407E-A947-70E740481C1C}">
                           <a14:useLocalDpi xmlns:a14="http://schemas.microsoft.com/office/drawing/2010/main" val="0"/>
@@ -856,7 +925,7 @@
                     </pic:cNvPicPr>
                   </pic:nvPicPr>
                   <pic:blipFill>
-                    <a:blip r:embed="rId16">
+                    <a:blip r:embed="rId17">
                       <a:extLst>
                         <a:ext uri="{28A0092B-C50C-407E-A947-70E740481C1C}">
                           <a14:useLocalDpi xmlns:a14="http://schemas.microsoft.com/office/drawing/2010/main" val="0"/>
@@ -900,6 +969,7 @@
         <w:rPr>
           <w:lang w:val="en-US"/>
         </w:rPr>
+        <w:lastRenderedPageBreak/>
         <w:t xml:space="preserve">Brief </w:t>
       </w:r>
       <w:proofErr w:type="gramStart"/>
@@ -933,7 +1003,6 @@
     </w:p>
     <w:p>
       <w:r>
-        <w:lastRenderedPageBreak/>
         <w:t>A pipeline was built with a Get Metadata activity to validate file existence and a Copy Data activity to transfer the CSV from source to destination. The pipeline was executed successfully, and the copied file appeared in the destination container.</w:t>
       </w:r>
     </w:p>

</xml_diff>